<commit_message>
Part 1: compliance round-1 fixes, figures, status records
Co-Authored-By: Claude Sonnet 5.5 <noreply@anthropic.com>
Claude-Session: https://claude.ai/code/session_0168JnD9FtTqg34DkRs7Q2We
</commit_message>
<xml_diff>
--- a/books/emergency-medicine/previews/ch01.docx
+++ b/books/emergency-medicine/previews/ch01.docx
@@ -40,7 +40,7 @@
         <w:pStyle w:val="Compact"/>
       </w:pPr>
       <w:r>
-        <w:t xml:space="preserve">Explain how triage assigns priority and apply a five-level acuity idea to short scenarios.</w:t>
+        <w:t xml:space="preserve">Explain how triage assigns priority using a generic five-level idea.</w:t>
       </w:r>
     </w:p>
     <w:p>
@@ -64,7 +64,7 @@
         <w:pStyle w:val="Compact"/>
       </w:pPr>
       <w:r>
-        <w:t xml:space="preserve">Describe how to gather a focused history and a set of vital signs, and name abnormal findings.</w:t>
+        <w:t xml:space="preserve">Describe how to gather a focused history and a set of vital signs, and recognize and report a worsening trend.</w:t>
       </w:r>
     </w:p>
     <w:p>
@@ -84,7 +84,7 @@
         <w:pStyle w:val="FirstParagraph"/>
       </w:pPr>
       <w:r>
-        <w:t xml:space="preserve">Every emergency starts the same way. Someone arrives at a scene they did not choose, takes in far more than they can process, and has a few seconds to decide what matters first. The people who handle this well are rarely the ones who know the most. They are the ones who have a fixed order of thinking and follow it while their pulse is racing.</w:t>
+        <w:t xml:space="preserve">Every emergency starts the same way. Someone arrives at a scene they did not choose, takes in far more than they can process, and has a few seconds to decide what matters first. People who handle this well have a fixed order of thinking and follow it while their pulse is racing.</w:t>
       </w:r>
     </w:p>
     <w:p>
@@ -137,7 +137,7 @@
         <w:t xml:space="preserve"> </w:t>
       </w:r>
       <w:r>
-        <w:t xml:space="preserve">Scene safety is the habit of judging risk before contact. It has three parts: the environment, the people present, and your own protection. A safe approach is not a delay. Taking ten deliberate seconds at the edge of a scene is faster than treating two patients instead of one.</w:t>
+        <w:t xml:space="preserve">Scene safety is the habit of judging risk before contact. It has three parts: the environment, the people present, and your own protection. A few deliberate seconds at the edge of a scene cost far less than treating a second patient.</w:t>
       </w:r>
     </w:p>
     <w:p>
@@ -151,7 +151,7 @@
         <w:t xml:space="preserve"> </w:t>
       </w:r>
       <w:r>
-        <w:t xml:space="preserve">Emergencies create their own hazards. A crash scene may have traffic still moving. A patient who is confused or frightened may strike out without meaning to. A spilled fluid may be slippery or harmful to skin. Because you are focused on the patient, you are the person least likely to notice these things, so the check must be a routine step that you do every time and not a judgment call that you make only when something looks wrong.</w:t>
+        <w:t xml:space="preserve">Emergencies create their own hazards. A crash scene may have traffic still moving. A patient who is confused or frightened may strike out without meaning to. A spilled fluid may be slippery or harmful to skin. Because you are focused on the patient, you are the person least likely to notice these things, so the check must be a routine step you take every time.</w:t>
       </w:r>
     </w:p>
     <w:p>
@@ -269,7 +269,7 @@
         <w:pStyle w:val="BodyText"/>
       </w:pPr>
       <w:r>
-        <w:t xml:space="preserve">Do not enter a scene you believe is unsafe. If violence, fire, unstable ground, live electrical equipment or traffic is present and you cannot control it, stay back and call for help. Giving medicines is outside many roles; follow your scope and medical direction.</w:t>
+        <w:t xml:space="preserve">Do not enter a scene you believe is unsafe. If violence, fire, unstable ground, live electrical equipment or traffic is present and you cannot control it, stay back and call for help.</w:t>
       </w:r>
     </w:p>
     <w:p>
@@ -309,7 +309,7 @@
         <w:t xml:space="preserve"> </w:t>
       </w:r>
       <w:r>
-        <w:t xml:space="preserve">Emergency work asks you to see injury, fear and sometimes death, and it is normal for this to leave its mark. Do not treat strong reactions after a hard call as a personal failing. Eat, drink and rest when you can, tell a trusted colleague or supervisor when something stays with you, and ask whether your service or school offers a debrief or peer support. Seeking that help is part of staying safe to work, not a sign that you are unfit for it.</w:t>
+        <w:t xml:space="preserve">Emergency work asks you to see injury, fear and sometimes death, and it is normal for this to leave its mark. Do not treat strong reactions after a hard call as a personal failing. Eat, drink and rest when you can, tell a trusted colleague or supervisor when something stays with you, and ask whether your service or school offers a debrief or peer support. Seeking that help is part of staying safe to work.</w:t>
       </w:r>
     </w:p>
     <w:p>
@@ -365,7 +365,7 @@
         <w:pStyle w:val="FirstParagraph"/>
       </w:pPr>
       <w:r>
-        <w:t xml:space="preserve">Triage is not a judgment about who deserves care. It is a way of deciding who cannot wait. A patient who walks in talking, holding a swollen ankle, can sit for a while. A patient who looks calm but is breathing far too fast cannot, and the person at the desk has perhaps thirty seconds to notice. This entry gives you a short, repeatable way to sort patients so that the quiet emergency is not missed behind the loud inconvenience.</w:t>
+        <w:t xml:space="preserve">Triage is not a judgment about who deserves care. It is a way of deciding who cannot wait. A patient who walks in talking, holding a swollen ankle, can sit for a while. A patient who looks calm but is breathing far too fast cannot, and the person at the desk has only moments to notice. This entry gives you a short, repeatable way to sort patients so that the quiet emergency is not missed behind the loud inconvenience.</w:t>
       </w:r>
     </w:p>
     <w:p>
@@ -379,7 +379,7 @@
         <w:t xml:space="preserve"> </w:t>
       </w:r>
       <w:r>
-        <w:t xml:space="preserve">Triage is the process of sorting patients by urgency so that limited people, space and equipment reach the sickest first. The word comes from the French for sorting, and the idea is older than any modern emergency department. In an emergency department, triage is usually done by a nurse within minutes of arrival. At a scene with many casualties, the same logic is applied by whoever arrives first, quickly and with little equipment. Different places use different tools, and local protocol decides which one you use.</w:t>
+        <w:t xml:space="preserve">Triage is the process of sorting patients by urgency so that limited people, space and equipment reach the sickest first. The word comes from the French for sorting. In a US emergency department (ED), triage is usually done by a specially trained nurse soon after the patient arrives. At a scene with many casualties, the same logic is applied quickly and with little equipment, under local protocol. Different places use different tools, and local protocol decides which one you use.</w:t>
       </w:r>
     </w:p>
     <w:p>
@@ -393,7 +393,7 @@
         <w:t xml:space="preserve"> </w:t>
       </w:r>
       <w:r>
-        <w:t xml:space="preserve">Emergency departments, ambulances and scenes are never staffed for every patient at once. When demand is higher than capacity, the order in which patients are seen is itself a treatment decision. A good sorting method protects the patient who does not complain, such as the older adult with a vague story who is in fact seriously ill, from being passed over in favor of someone who is louder or more distressed but more stable.</w:t>
+        <w:t xml:space="preserve">Emergency departments, ambulances and scenes are often not staffed for every patient at once. When demand is higher than capacity, the order in which patients are seen is itself a treatment decision. A good sorting method protects the patient who does not complain, such as the older adult with a vague story who may be seriously ill, from being passed over in favor of someone who is louder or more distressed but more stable.</w:t>
       </w:r>
     </w:p>
     <w:p>
@@ -423,15 +423,23 @@
         <w:pStyle w:val="BodyText"/>
       </w:pPr>
       <w:r>
-        <w:t xml:space="preserve">Ask four things in order: Is this patient dying now? Should this patient not wait? How much will this patient need? Are the vital signs safe for that level?</w:t>
-      </w:r>
-    </w:p>
-    <w:p>
-      <w:pPr>
-        <w:pStyle w:val="BodyText"/>
-      </w:pPr>
-      <w:r>
-        <w:t xml:space="preserve">The first question asks whether the patient needs an immediate life-saving action, such as help with an obstructed airway or resuscitation. If yes, that patient is at the top level and you act at once. The second question asks whether the patient is in a high-risk situation, is newly confused or drowsy, or is in severe pain or distress. Such patients are very unwell and should not wait, even though no action needs to happen in the next few seconds. If neither applies, the remaining patients are sorted by how many different kinds of resources they are likely to need, such as laboratory tests, imaging or procedures. The last step is to check the vital signs against the level you chose and move the patient up if they are in a danger range.</w:t>
+        <w:t xml:space="preserve">Sort by danger before convenience. Look first for the patient who may die soon, then for the one who must not wait, then count what each of the others will need, and let the vital signs have the last word.</w:t>
+      </w:r>
+    </w:p>
+    <w:p>
+      <w:pPr>
+        <w:pStyle w:val="BodyText"/>
+      </w:pPr>
+      <w:r>
+        <w:t xml:space="preserve">The first question asks whether the patient will die or be harmed within minutes without help, for example from an obstructed airway or a stopped heart. If yes, that patient is at the top level and you act at once. The second question asks whether the patient could worsen quickly, seems newly confused or drowsy, or is in severe pain. Such patients are very unwell and should not wait, even though no action needs to happen in the next few seconds. If neither applies, the remaining patients are sorted by how many separate tests or treatments they will probably need, such as laboratory tests, imaging or procedures. The last step is to check the vital signs against the level you chose and consider moving the patient up if they are in a danger range (Entry 1.4 gives typical resting values).</w:t>
+      </w:r>
+    </w:p>
+    <w:p>
+      <w:pPr>
+        <w:pStyle w:val="BodyText"/>
+      </w:pPr>
+      <w:r>
+        <w:t xml:space="preserve">Figure 1 shows the sequence.</w:t>
       </w:r>
     </w:p>
     <w:p>
@@ -443,7 +451,7 @@
           <wp:inline>
             <wp:extent cx="4000500" cy="4000500"/>
             <wp:effectExtent b="0" l="0" r="0" t="0"/>
-            <wp:docPr descr="Figure 2. A generic five-level triage sequence. Notice that the first two questions are about danger, not about numbers or paperwork." title="" id="22" name="Picture"/>
+            <wp:docPr descr="Figure 1. A generic five-level triage sequence, in which the first two questions ask about danger, not paperwork." title="" id="22" name="Picture"/>
             <a:graphic>
               <a:graphicData uri="http://schemas.openxmlformats.org/drawingml/2006/picture">
                 <pic:pic>
@@ -499,13 +507,13 @@
           <w:bCs/>
           <w:b/>
         </w:rPr>
-        <w:t xml:space="preserve">Figure 2.</w:t>
-      </w:r>
-      <w:r>
-        <w:t xml:space="preserve"> </w:t>
-      </w:r>
-      <w:r>
-        <w:t xml:space="preserve">A generic five-level triage sequence. Notice that the first two questions are about danger, not about numbers or paperwork.</w:t>
+        <w:t xml:space="preserve">Figure 1.</w:t>
+      </w:r>
+      <w:r>
+        <w:t xml:space="preserve"> </w:t>
+      </w:r>
+      <w:r>
+        <w:t xml:space="preserve">A generic five-level triage sequence, in which the first two questions ask about danger, not paperwork.</w:t>
       </w:r>
     </w:p>
     <w:p>
@@ -591,7 +599,7 @@
               <w:jc w:val="left"/>
             </w:pPr>
             <w:r>
-              <w:t xml:space="preserve">Needs an immediate life-saving action</w:t>
+              <w:t xml:space="preserve">May die or be harmed within minutes without help</w:t>
             </w:r>
           </w:p>
         </w:tc>
@@ -629,7 +637,7 @@
               <w:jc w:val="left"/>
             </w:pPr>
             <w:r>
-              <w:t xml:space="preserve">High-risk, newly confused or in severe distress</w:t>
+              <w:t xml:space="preserve">Could worsen quickly, newly confused, or in severe pain</w:t>
             </w:r>
           </w:p>
         </w:tc>
@@ -667,7 +675,7 @@
               <w:jc w:val="left"/>
             </w:pPr>
             <w:r>
-              <w:t xml:space="preserve">Stable, but expected to need several resources</w:t>
+              <w:t xml:space="preserve">Stable, but expected to need two or more separate tests or treatments</w:t>
             </w:r>
           </w:p>
         </w:tc>
@@ -705,7 +713,7 @@
               <w:jc w:val="left"/>
             </w:pPr>
             <w:r>
-              <w:t xml:space="preserve">Stable, expected to need one resource</w:t>
+              <w:t xml:space="preserve">Stable, expected to need one test or treatment</w:t>
             </w:r>
           </w:p>
         </w:tc>
@@ -743,7 +751,7 @@
               <w:jc w:val="left"/>
             </w:pPr>
             <w:r>
-              <w:t xml:space="preserve">Stable, expected to need no resources</w:t>
+              <w:t xml:space="preserve">Stable, expected to need no tests or treatments</w:t>
             </w:r>
           </w:p>
         </w:tc>
@@ -766,7 +774,7 @@
         <w:pStyle w:val="BodyText"/>
       </w:pPr>
       <w:r>
-        <w:t xml:space="preserve">A level is a starting point, not a verdict. Patients move between levels as you watch them. A person given level four on arrival who becomes short of breath in the waiting room is now level two, and the reason you recheck is to catch that change.</w:t>
+        <w:t xml:space="preserve">A level is a starting point, not a verdict. Patients move between levels as you watch them. A person given level four on arrival who becomes short of breath in the waiting room must be reassessed at once and moved to a higher level.</w:t>
       </w:r>
     </w:p>
     <w:p>
@@ -780,7 +788,7 @@
         <w:t xml:space="preserve"> </w:t>
       </w:r>
       <w:r>
-        <w:t xml:space="preserve">Triage does not diagnose. It does not say what is wrong, only how soon someone must be seen. It is also not a ranking of worth. Two patients with the same level may be seen in the order they arrived, and a patient who waits longer is not a lower-priority person, only one whose condition allows waiting. Say this to patients and families in plain words, because waiting is easier when people understand the reason for it.</w:t>
+        <w:t xml:space="preserve">Triage does not diagnose. It does not say what is wrong, only how soon someone must be seen. Two patients with the same level are often seen in the order they arrived, unless one gets worse. A patient who waits longer is one whose condition allows waiting. Say this to patients and families in plain words, because waiting is easier when people understand the reason for it.</w:t>
       </w:r>
     </w:p>
     <w:p>
@@ -794,7 +802,7 @@
         <w:t xml:space="preserve"> </w:t>
       </w:r>
       <w:r>
-        <w:t xml:space="preserve">Four errors appear again and again. The first is anchoring on the loudest complaint and missing the quiet one. The second is trusting a calm appearance, because patients who are very ill may be quiet, tired or confused, not agitated. The third is using one set of vital signs as if it were permanent. The fourth is letting the label stick: a patient already sorted to a low level can be forgotten for hours unless someone is responsible for rechecking. Build a habit of glancing at the waiting area each time you pass it.</w:t>
+        <w:t xml:space="preserve">Four errors appear again and again. The first is anchoring on the loudest complaint and missing the quiet one. The second is trusting a calm appearance, because patients who are very ill may be quiet, tired or confused, not agitated. The third is using one set of vital signs as if it were permanent. The fourth is letting the label stick: a patient already sorted to a low level can be overlooked for a long time unless someone is responsible for rechecking. Build a habit of glancing at the waiting area each time you pass it.</w:t>
       </w:r>
     </w:p>
     <w:p>
@@ -896,7 +904,7 @@
         <w:t xml:space="preserve"> </w:t>
       </w:r>
       <w:r>
-        <w:t xml:space="preserve">The primary survey is a rapid, whole-patient look for immediate threats to life. It is not a diagnosis and it is not a full examination. Its aim is to keep the patient alive and improve their condition, which buys time for further treatment and for working out what is wrong. The same approach applies to every critically ill or deteriorating patient, whatever the cause.</w:t>
+        <w:t xml:space="preserve">The primary survey is a rapid, whole-patient look for immediate threats to life. It does not diagnose and it does not replace a full examination. Its aim is to keep the patient alive and improve their condition, which buys time for further treatment and for working out what is wrong. The same approach applies to every critically ill or deteriorating patient, whatever the cause.</w:t>
       </w:r>
     </w:p>
     <w:p>
@@ -910,7 +918,7 @@
         <w:t xml:space="preserve"> </w:t>
       </w:r>
       <w:r>
-        <w:t xml:space="preserve">The letters follow how quickly each failure kills. A blocked airway stops oxygen reaching the lungs within moments, so nothing that comes later can help until the airway is open. Breathing comes next because an open airway is useless without air moving. Circulation follows because oxygen must be carried to the brain and heart. Disability, which means checking how the brain is working, comes after those, and Exposure, which means looking at the rest of the body, comes last. Severe bleeding is the one exception that rearranges the sequence. When blood loss is heavy and visible, you control it first, because there is little point in checking the airway of a patient who is bleeding to death. Entry 4.1 explains how bleeding is brought forward in trauma.</w:t>
+        <w:t xml:space="preserve">The letters follow how quickly each failure kills. A blocked airway stops oxygen reaching the lungs within moments, so nothing that comes later can help until the airway is open. Breathing comes next because an open airway is useless without air moving. Circulation follows because oxygen must be carried to the brain and heart. Disability, which means checking how the brain is working, comes after those, and Exposure, which means looking at the rest of the body, comes last. Severe bleeding is the one exception that rearranges the sequence. When blood loss is heavy and visible, many trauma protocols direct you to control it first, because there is little point in checking the airway of a patient who is bleeding to death. Entry 4.1 explains how bleeding is brought forward in trauma.</w:t>
       </w:r>
     </w:p>
     <w:p>
@@ -926,7 +934,7 @@
         <w:pStyle w:val="BodyText"/>
       </w:pPr>
       <w:r>
-        <w:t xml:space="preserve">Fix each problem as you find it, then move on. Recheck after every action you take.</w:t>
+        <w:t xml:space="preserve">Find it, fix it, check again. After any treatment, wait a short while before judging its effect, then repeat the survey.</w:t>
       </w:r>
     </w:p>
     <w:p>
@@ -958,7 +966,7 @@
         <w:t xml:space="preserve"> </w:t>
       </w:r>
       <w:r>
-        <w:t xml:space="preserve">If they appear unconscious, speak to them and shake the shoulders gently as you ask whether they are all right. A patient who answers in a normal voice has an open airway, is breathing and has enough blood flow to the brain for the moment. A patient who speaks only in short sentences may have a breathing problem. A patient who does not respond is critically ill until shown otherwise. This look takes about thirty seconds and often tells you at once that the patient needs urgent help. If the patient is unresponsive and not breathing normally, start CPR as set out in Entry 3.4. Occasional gasps are not normal breathing.</w:t>
+        <w:t xml:space="preserve">If they appear unconscious, speak to them loudly. If you can rule out a neck injury, tap the shoulders gently as you ask whether they are all right; if a neck injury is possible, do not shake the patient and keep the head and neck still. A patient who answers in a normal voice has an open airway, is breathing and is probably getting enough blood to the brain for the moment. A patient who speaks only in short sentences may have a breathing problem. A patient who does not respond is critically ill until shown otherwise. This look takes about 30 seconds and often tells you at once that the patient needs urgent help. If the patient is unresponsive and not breathing normally, call for help and start cardiopulmonary resuscitation (CPR) as set out in Entry 3.4. Occasional gasps are not normal breathing.</w:t>
       </w:r>
     </w:p>
     <w:p>
@@ -972,7 +980,7 @@
         <w:t xml:space="preserve"> </w:t>
       </w:r>
       <w:r>
-        <w:t xml:space="preserve">Ask whether air can get in and out. Talking means the airway is open. Noisy breathing is a warning, because snoring, gurgling or a high-pitched sound means the airway is partly blocked. Complete blockage may give no sound at all, with the chest and abdomen moving in opposite directions as the patient strains. Clear and open the airway with the simple measures in Entry 2.2, and call for help at once.</w:t>
+        <w:t xml:space="preserve">Ask whether air can get in and out. Talking means the airway is open. Noisy breathing is a warning, because a partly blocked airway is often noisy, and a high-pitched sound such as stridor suggests a significant partial blockage. Complete blockage may give no sound at all, with the chest and abdomen moving in opposite directions as the patient strains. Clear and open the airway with the simple measures in Entry 2.2, and call for help at once.</w:t>
       </w:r>
     </w:p>
     <w:p>
@@ -986,7 +994,7 @@
         <w:t xml:space="preserve"> </w:t>
       </w:r>
       <w:r>
-        <w:t xml:space="preserve">Look, listen and feel. Count the breathing rate over a full minute if you can, and watch for effort: sweating, use of the neck and shoulder muscles, belly breathing, or a gray or blue tint to the lips. A high or rising rate is a warning that the patient may deteriorate suddenly. Note how deeply the patient breathes and whether both sides of the chest move equally. If you have a pulse oximeter, record the reading, and remember what it does not tell you, as Entry 1.4 explains.</w:t>
+        <w:t xml:space="preserve">Look, listen and feel. Count the breathing rate (respiratory rate, RR) carefully, for as long as your protocol directs, and watch for effort: sweating, use of the neck and shoulder muscles, belly breathing, or a gray or blue tint to the lips. A high or rising rate is a warning that the patient may deteriorate suddenly. Note how deeply the patient breathes and whether both sides of the chest move equally. If you have a pulse oximeter, record the reading, and remember what it does not tell you, as Entry 1.4 explains.</w:t>
       </w:r>
     </w:p>
     <w:p>
@@ -1000,7 +1008,7 @@
         <w:t xml:space="preserve"> </w:t>
       </w:r>
       <w:r>
-        <w:t xml:space="preserve">Look at the skin of the hands: is it pink, pale, blue or mottled? Feel whether the hands are warm or cool. Check the capillary refill time by pressing on a fingertip, held level with the heart, for five seconds, then timing how long the color takes to return. In a healthy adult it is usually under two seconds, and a longer time suggests poor blood flow to the skin, though a cold room or cold hands can also lengthen it. Feel a pulse and note whether it is fast, slow, weak, strong or irregular. A bounding pulse and a barely palpable one both matter. Look for bleeding you can see, and think about where blood might be hiding, in the chest, abdomen or pelvis. Entry 3.5 explains shock in full.</w:t>
+        <w:t xml:space="preserve">Look at the skin of the hands: is it pink, pale, blue or mottled? Feel whether the hands are warm or cool. Check the capillary refill time by pressing on a fingertip, held level with the heart, for 5 seconds, then timing how long the color takes to return. In a healthy adult it is usually under 2 seconds, and a longer time suggests poor blood flow to the skin, though a cold room or cold hands can also lengthen it. Feel a pulse and note whether it is fast, slow, weak, strong or irregular. A bounding pulse and a barely palpable one both matter. Look for bleeding you can see, and think about where blood might be hiding, in the chest, abdomen or pelvis. Entry 3.5 explains shock in full.</w:t>
       </w:r>
     </w:p>
     <w:p>
@@ -1014,7 +1022,7 @@
         <w:t xml:space="preserve"> </w:t>
       </w:r>
       <w:r>
-        <w:t xml:space="preserve">This step checks how the brain is working. Begin with the quickest tool, the AVPU scale. Is the patient Alert? Do they respond only to Voice? Only to Pain? Are they Unresponsive? Many services add a letter for new confusion, so that the scale reads A, C, V, P, U, and new confusion in a previously normal patient is treated as a serious sign. Where your protocol uses it, the Glasgow Coma Scale gives a fuller picture. It scores three responses: eye opening, verbal response and motor response. The three scores are added to give a total from 3 to 15, where 15 means the patient is fully alert. Lower scores mean greater impairment, and a falling score over time matters more than a single number. Check the pupils for size, equality and reaction to light, and check the blood glucose, because low blood sugar can cause confusion or loss of consciousness and is quickly reversible. Entry 5.1 covers its causes and management.</w:t>
+        <w:t xml:space="preserve">This step checks how the brain is working. Begin with the quickest tool, the AVPU scale. Is the patient Alert? Do they respond only to Voice? Only to Pain? Are they Unresponsive? Some services add a letter for new confusion, so that the scale reads A, C, V, P, U, and new confusion in a previously normal patient is treated as a serious sign. Where your protocol uses it, the Glasgow Coma Scale gives a fuller picture. It scores three responses: eye opening, verbal response and motor response. The three scores are added to give a total from 3 to 15, where 15 is the highest score. Lower scores mean greater impairment, and the trend over time is important in showing when new action is needed. Check the pupils for size, equality and reaction to light, and check the blood glucose, because low blood glucose can cause confusion or loss of consciousness and is treatable. Entry 5.1 covers its causes and management.</w:t>
       </w:r>
     </w:p>
     <w:p>
@@ -1068,7 +1076,7 @@
         <w:pStyle w:val="Compact"/>
       </w:pPr>
       <w:r>
-        <w:t xml:space="preserve">Take the first look: speak to the patient and watch the response for about thirty seconds.</w:t>
+        <w:t xml:space="preserve">Take the first look: speak to the patient and watch the response for about 30 seconds; if heavy bleeding is visible, your protocol may direct you to control it first (Entry 4.1).</w:t>
       </w:r>
     </w:p>
     <w:p>
@@ -1168,7 +1176,7 @@
         <w:pStyle w:val="BodyText"/>
       </w:pPr>
       <w:r>
-        <w:t xml:space="preserve">Treat the patient’s cervical spine with care if there is any chance of neck injury, and do not move an injured patient unless the scene is unsafe. Wait a short while after any treatment before judging its effect, because some treatments take minutes to work. Giving medicines is outside many roles; follow your scope and medical direction.</w:t>
+        <w:t xml:space="preserve">Treat the neck (cervical spine) with care if there is any chance of neck injury, and do not move an injured patient unless the scene is unsafe or you must move them to give life-saving care such as CPR, as your protocol directs.</w:t>
       </w:r>
     </w:p>
     <w:p>
@@ -1213,6 +1221,14 @@
     </w:p>
     <w:p>
       <w:pPr>
+        <w:pStyle w:val="BodyText"/>
+      </w:pPr>
+      <w:r>
+        <w:t xml:space="preserve">Figure 2 shows the loop.</w:t>
+      </w:r>
+    </w:p>
+    <w:p>
+      <w:pPr>
         <w:pStyle w:val="CaptionedFigure"/>
       </w:pPr>
       <w:r>
@@ -1220,7 +1236,7 @@
           <wp:inline>
             <wp:extent cx="4000500" cy="2381250"/>
             <wp:effectExtent b="0" l="0" r="0" t="0"/>
-            <wp:docPr descr="Figure 1. The primary survey as a loop. Each check is followed by treatment of any problem found, and the whole loop is repeated after every intervention." title="" id="26" name="Picture"/>
+            <wp:docPr descr="Figure 2. The primary survey as a loop, with treatment after each check and a repeat of the whole loop after every intervention." title="" id="26" name="Picture"/>
             <a:graphic>
               <a:graphicData uri="http://schemas.openxmlformats.org/drawingml/2006/picture">
                 <pic:pic>
@@ -1276,13 +1292,13 @@
           <w:bCs/>
           <w:b/>
         </w:rPr>
-        <w:t xml:space="preserve">Figure 1.</w:t>
-      </w:r>
-      <w:r>
-        <w:t xml:space="preserve"> </w:t>
-      </w:r>
-      <w:r>
-        <w:t xml:space="preserve">The primary survey as a loop. Each check is followed by treatment of any problem found, and the whole loop is repeated after every intervention.</w:t>
+        <w:t xml:space="preserve">Figure 2.</w:t>
+      </w:r>
+      <w:r>
+        <w:t xml:space="preserve"> </w:t>
+      </w:r>
+      <w:r>
+        <w:t xml:space="preserve">The primary survey as a loop, with treatment after each check and a repeat of the whole loop after every intervention.</w:t>
       </w:r>
     </w:p>
     <w:p>
@@ -1368,7 +1384,7 @@
         <w:t xml:space="preserve"> </w:t>
       </w:r>
       <w:r>
-        <w:t xml:space="preserve">The secondary survey has two strands that run together. One is the history, which asks the patient, family, bystanders and records what happened. The other is the examination, which includes a full set of vital signs and a head-to-toe check. In an unstable patient the secondary survey is shortened or postponed so that treatment and transport are not delayed.</w:t>
+        <w:t xml:space="preserve">The secondary survey has two strands that run together. One is the history, which asks the patient, family, bystanders and records what happened. The other is the examination, which includes a full set of vital signs and a head-to-toe check. In an unstable patient the secondary survey is usually shortened or postponed so that treatment and transport are not delayed.</w:t>
       </w:r>
     </w:p>
     <w:p>
@@ -1382,7 +1398,7 @@
         <w:t xml:space="preserve"> </w:t>
       </w:r>
       <w:r>
-        <w:t xml:space="preserve">A short, structured set of questions keeps the history focused. Ask what happened and when it started. Ask about the main symptom: where it is, how bad it is and what makes it better or worse. Ask about allergies, current medicines, past illnesses, the last meal or drink, and the events leading up to the problem. These questions are often remembered with a mnemonic, and your school or service will teach one. What matters is not the letters but the habit of covering the ground the same way every time, so that nothing important, such as an allergy or a blood-thinning medicine, is forgotten. If the patient cannot talk, turn to family, bystanders, medical alert jewelry or records, and note who gave each piece of information.</w:t>
+        <w:t xml:space="preserve">A short, structured set of questions keeps the history focused. Ask what happened and when it started. Ask about the main symptom: where it is, how bad it is and what makes it better or worse. Ask about allergies, current medicines, past illnesses, the last meal or drink, and the events leading up to the problem. These questions are often remembered with a mnemonic, and your school or service will teach one. Use the mnemonic you are taught and cover the same ground in the same order every time, so that nothing important, such as an allergy or a blood-thinning medicine, is forgotten. If the patient cannot talk, turn to family, bystanders, medical alert jewelry or records, and note who gave each piece of information.</w:t>
       </w:r>
     </w:p>
     <w:p>
@@ -1396,7 +1412,7 @@
         <w:t xml:space="preserve"> </w:t>
       </w:r>
       <w:r>
-        <w:t xml:space="preserve">Vital signs are measurements of essential body functions: heart rate, breathing rate, blood pressure, temperature and oxygen saturation. Normal values change with age, sex, weight, fitness and overall health, so the ranges below describe a healthy adult at rest and should be read as a guide, not a rule.</w:t>
+        <w:t xml:space="preserve">Vital signs are measurements of essential body functions: heart rate, breathing rate, blood pressure and temperature, usually with oxygen saturation added. Normal values change with age, sex, weight, fitness and overall health, so the ranges below describe a healthy adult at rest and should be read as a guide, not a rule.</w:t>
       </w:r>
     </w:p>
     <w:p>
@@ -1558,7 +1574,15 @@
         <w:pStyle w:val="BodyText"/>
       </w:pPr>
       <w:r>
-        <w:t xml:space="preserve">Treat the trend as more informative than any one reading. A breathing rate that climbs from 18 to 28 over twenty minutes tells you more than a single count, and breathing rates above about 25 breaths per minute are widely treated as a sign that a patient may be heading for trouble. Blood pressure can stay normal for a time even in shock, because the body tightens its blood vessels to compensate, so a normal reading does not by itself make a patient safe.</w:t>
+        <w:t xml:space="preserve">A reading outside its range is an abnormal finding. Report it, and treat a large departure, or any departure in a patient who looks unwell, as urgent.</w:t>
+      </w:r>
+    </w:p>
+    <w:p>
+      <w:pPr>
+        <w:pStyle w:val="BodyText"/>
+      </w:pPr>
+      <w:r>
+        <w:t xml:space="preserve">Treat the trend as more informative than any one reading. A breathing rate that climbs from 18 to 28 over 20 minutes tells you more than a single count, and a breathing rate above about 25 breaths per minute is a marker of illness that calls for urgent attention and a call to your supervisor. Blood pressure can stay normal for a time even in shock, because the body tightens its blood vessels to compensate, so a normal reading does not by itself make a patient safe.</w:t>
       </w:r>
     </w:p>
     <w:p>
@@ -1572,7 +1596,15 @@
         <w:t xml:space="preserve"> </w:t>
       </w:r>
       <w:r>
-        <w:t xml:space="preserve">A pulse oximeter clips on a finger and estimates the percentage of hemoglobin carrying oxygen. It is useful, but it has limits that you must know. It does not measure how well a patient is breathing out carbon dioxide, so a patient receiving extra oxygen can have a normal reading while still ventilating poorly. Readings can also be less accurate with poor circulation, cold hands, certain nail polish, motion and differences in skin pigmentation, and the device can be misled by some poisons. Read the number together with the patient’s color, effort and mental state. A reassuring number in a patient who looks ill should not reassure you.</w:t>
+        <w:t xml:space="preserve">A pulse oximeter clips on a finger and estimates the percentage of hemoglobin carrying oxygen. It is useful, but it has limits that you must know. It does not measure how well a patient is breathing out carbon dioxide, so a patient can have a normal reading while still ventilating poorly. Readings can also be less accurate with poor circulation, cold hands, some nail polish colors, motion and differences in skin pigmentation, and the device can be misled by carbon monoxide poisoning. Read the number together with the patient’s color, effort and mental state. A reassuring number in a patient who looks ill should not reassure you.</w:t>
+      </w:r>
+    </w:p>
+    <w:p>
+      <w:pPr>
+        <w:pStyle w:val="BodyText"/>
+      </w:pPr>
+      <w:r>
+        <w:t xml:space="preserve">Figure 3 shows the places to check.</w:t>
       </w:r>
     </w:p>
     <w:p>
@@ -1584,7 +1616,7 @@
           <wp:inline>
             <wp:extent cx="5334000" cy="3911600"/>
             <wp:effectExtent b="0" l="0" r="0" t="0"/>
-            <wp:docPr descr="Figure 3. Where to check a pulse, breathing and skin perfusion on an adult. Check in the same places each time so that your findings can be compared." title="" id="30" name="Picture"/>
+            <wp:docPr descr="Figure 3. Where to check pulse, breathing and skin perfusion on an adult, in the same places each time." title="" id="30" name="Picture"/>
             <a:graphic>
               <a:graphicData uri="http://schemas.openxmlformats.org/drawingml/2006/picture">
                 <pic:pic>
@@ -1646,7 +1678,7 @@
         <w:t xml:space="preserve"> </w:t>
       </w:r>
       <w:r>
-        <w:t xml:space="preserve">Where to check a pulse, breathing and skin perfusion on an adult. Check in the same places each time so that your findings can be compared.</w:t>
+        <w:t xml:space="preserve">Where to check pulse, breathing and skin perfusion on an adult, in the same places each time.</w:t>
       </w:r>
     </w:p>
     <w:p>
@@ -1660,7 +1692,7 @@
         <w:t xml:space="preserve"> </w:t>
       </w:r>
       <w:r>
-        <w:t xml:space="preserve">Work from the head down: scalp and face, eyes, ears, nose and mouth, neck, chest, abdomen, pelvis, back, arms and legs. Look, then feel gently, and ask about pain. Note wounds, deformity, swelling, bruising and anything that looks wrong or smells wrong. Record the time of each set of observations. When the patient has no obvious problem, the secondary survey is your best chance to find a hidden one.</w:t>
+        <w:t xml:space="preserve">Work from the head down: scalp and face, eyes, ears, nose and mouth, neck, chest, abdomen, pelvis, back, arms and legs. Look, then feel gently, and ask about pain. Note wounds, deformity, swelling, bruising and anything that looks wrong or smells wrong. Record the time of each set of observations.</w:t>
       </w:r>
     </w:p>
     <w:p>
@@ -1676,7 +1708,7 @@
         <w:pStyle w:val="BodyText"/>
       </w:pPr>
       <w:r>
-        <w:t xml:space="preserve">Taking vital signs is a core skill for nursing, paramedic and EMT students, but interpreting patterns and acting on them is done with your supervisor and under local protocol. Always tell a qualified clinician about an abnormal or worsening finding at once.</w:t>
+        <w:t xml:space="preserve">Taking vital signs is a core skill for nursing, paramedic and emergency medical technician (EMT) students, but interpreting patterns and acting on them is done with your supervisor and under local protocol. Always tell a qualified clinician about an abnormal or worsening finding at once.</w:t>
       </w:r>
     </w:p>
     <w:p>
@@ -1712,7 +1744,7 @@
       </w:r>
     </w:p>
     <w:bookmarkEnd w:id="32"/>
-    <w:bookmarkStart w:id="36" w:name="X7232e8762eface2ee0615b55badf0d93fc1efdd"/>
+    <w:bookmarkStart w:id="36" w:name="X9b7fa0342ad2adb338ccdaf7265e81864ae47ca"/>
     <w:p>
       <w:pPr>
         <w:pStyle w:val="Heading2"/>
@@ -1724,7 +1756,7 @@
         <w:t xml:space="preserve"> </w:t>
       </w:r>
       <w:r>
-        <w:t xml:space="preserve">Communication, Consent, Handover and Reassessment</w:t>
+        <w:t xml:space="preserve">Communication, Consent, Scope of Practice, Handover, Reassessment and Documentation</w:t>
       </w:r>
     </w:p>
     <w:p>
@@ -1732,7 +1764,7 @@
         <w:pStyle w:val="FirstParagraph"/>
       </w:pPr>
       <w:r>
-        <w:t xml:space="preserve">A patient cared for well by three people is easily harmed when the three do not talk to each other. This last entry covers the work that holds a response together: speaking with the patient, obtaining consent, passing information on clearly, checking again, and writing down what you saw and did.</w:t>
+        <w:t xml:space="preserve">A patient cared for well by three people is easily harmed when the three do not talk to each other. This last entry covers the work that holds a response together: speaking with the patient, obtaining consent, staying within your scope, passing information on clearly, checking again, and writing down what you saw and did.</w:t>
       </w:r>
     </w:p>
     <w:p>
@@ -1746,7 +1778,21 @@
         <w:t xml:space="preserve"> </w:t>
       </w:r>
       <w:r>
-        <w:t xml:space="preserve">Introduce yourself, say what you are about to do and why, and ask permission before you touch. A patient who has capacity may accept or refuse care, and you respect that choice, tell a clinician and record it. In a true emergency, when a patient cannot take part in decisions and no one who can decide for them is available, treatment may start without prior consent, and the patient is told as soon as possible. The rules differ between states, services and roles, so follow your local protocol and the guidance of your supervisor.</w:t>
+        <w:t xml:space="preserve">Introduce yourself, say what you are about to do and why, and ask permission before you touch. A patient who has capacity, meaning the ability to understand the choice and its results, may accept or refuse care, and you respect that choice, tell a clinician and record it. In a true emergency, when a patient cannot take part in decisions and no one who can decide for them is available, treatment may start without prior consent, and the patient is told as soon as possible. The rules differ between states, services and roles, so follow your local protocol and the guidance of your supervisor.</w:t>
+      </w:r>
+    </w:p>
+    <w:p>
+      <w:pPr>
+        <w:pStyle w:val="BodyText"/>
+      </w:pPr>
+      <w:r>
+        <w:t xml:space="preserve">Scope of Practice.</w:t>
+      </w:r>
+      <w:r>
+        <w:t xml:space="preserve"> </w:t>
+      </w:r>
+      <w:r>
+        <w:t xml:space="preserve">Your scope of practice is the set of tasks your license, certification or student status allows. Do only what it allows, say plainly when a task is beyond it, and ask your supervisor before trying anything you have not been taught and cleared to do.</w:t>
       </w:r>
     </w:p>
     <w:p>
@@ -1760,7 +1806,15 @@
         <w:t xml:space="preserve"> </w:t>
       </w:r>
       <w:r>
-        <w:t xml:space="preserve">Handover is the structured passing of a patient’s information to the next team. One widely used format has four parts: Situation, Background, Assessment and Recommendation. Situation says who the patient is and what the main problem is. Background gives the history, medicines, allergies and what led up to this. Assessment gives your findings in the order of the primary survey, the vital signs and what you did. Recommendation states what you think should happen next or what you need from the receiver. A good handover is short, ordered and free of guesses presented as facts.</w:t>
+        <w:t xml:space="preserve">Handover is the structured passing of a patient’s information to the next team. One widely used format has four parts: Situation, Background, Assessment and Recommendation. Situation says who the patient is and what the main problem is. Background gives the history, medicines, allergies and what led up to this. Assessment gives your findings in the order of the primary survey, the vital signs and what you did. Recommendation states what you think should happen next or what you need from the receiver. A good handover is short, follows a fixed order, and labels a guess as a guess.</w:t>
+      </w:r>
+    </w:p>
+    <w:p>
+      <w:pPr>
+        <w:pStyle w:val="BodyText"/>
+      </w:pPr>
+      <w:r>
+        <w:t xml:space="preserve">Figure 4 shows the four parts.</w:t>
       </w:r>
     </w:p>
     <w:p>
@@ -1772,7 +1826,7 @@
           <wp:inline>
             <wp:extent cx="4000500" cy="2952750"/>
             <wp:effectExtent b="0" l="0" r="0" t="0"/>
-            <wp:docPr descr="Figure 4. A four-part structured handover. Each part answers one question for the person receiving the patient." title="" id="34" name="Picture"/>
+            <wp:docPr descr="Figure 4. A four-part handover in which each part answers one question for the receiver." title="" id="34" name="Picture"/>
             <a:graphic>
               <a:graphicData uri="http://schemas.openxmlformats.org/drawingml/2006/picture">
                 <pic:pic>
@@ -1834,7 +1888,7 @@
         <w:t xml:space="preserve"> </w:t>
       </w:r>
       <w:r>
-        <w:t xml:space="preserve">A four-part structured handover. Each part answers one question for the person receiving the patient.</w:t>
+        <w:t xml:space="preserve">A four-part handover in which each part answers one question for the receiver.</w:t>
       </w:r>
     </w:p>
     <w:p>
@@ -1848,7 +1902,7 @@
         <w:t xml:space="preserve"> </w:t>
       </w:r>
       <w:r>
-        <w:t xml:space="preserve">A patient who was stable a moment ago may not be stable now. Recheck the primary survey and vital signs at intervals set by the patient’s condition and your protocol, after every treatment, and before and after any move. Wait a short while after an intervention before judging its effect.</w:t>
+        <w:t xml:space="preserve">A patient who was stable a moment ago may not be stable now. Recheck the primary survey and vital signs at intervals set by the patient’s condition and your protocol, after every treatment, and before and after any move.</w:t>
       </w:r>
     </w:p>
     <w:p>
@@ -1862,7 +1916,7 @@
         <w:t xml:space="preserve"> </w:t>
       </w:r>
       <w:r>
-        <w:t xml:space="preserve">Write down what you found, what you did, when you did it and how the patient responded, using the times you recorded. Record facts and observations, not opinions, and keep the record accurate and legible. A clear record protects the patient, helps the next team, and protects you.</w:t>
+        <w:t xml:space="preserve">Write down what you found, what you did, when you did it and how the patient responded, using the times you recorded. Record facts and observations, not opinions, and keep the record accurate and legible. A clear record lets the next team see what has already been done and when.</w:t>
       </w:r>
     </w:p>
     <w:p>
@@ -1920,7 +1974,7 @@
         <w:pStyle w:val="BodyText"/>
       </w:pPr>
       <w:r>
-        <w:t xml:space="preserve">Priya was a second-year nursing student volunteering at a school sports day. She was carrying a water cooler across the field when a spectator in the stands, a man in his sixties, slid sideways on the bench. People nearby stood up and shouted. Priya stopped at the foot of the stands and looked before climbing. The bleachers were crowded and the step was wet from a spilled drink, so she slowed down, pulled on gloves from her pocket kit, and asked a nearby parent to find the event first-aid lead and bring the defibrillator box.</w:t>
+        <w:t xml:space="preserve">Priya was a second-year nursing student volunteering at a school sports day. She was carrying a water cooler across the field when a spectator in the stands, a man in his sixties, slid sideways on the bench. People nearby stood up and shouted. Priya stopped at the foot of the stands and looked before climbing. The bleachers were crowded and the step was wet from a spilled drink, so she slowed down, pulled on gloves from her kit bag, and asked a nearby parent to find the event first-aid lead and bring the automated external defibrillator.</w:t>
       </w:r>
     </w:p>
     <w:p>
@@ -1936,7 +1990,7 @@
         <w:pStyle w:val="BodyText"/>
       </w:pPr>
       <w:r>
-        <w:t xml:space="preserve">His airway was open, because he was making sound. She counted his breathing for a full minute and found it fast. His fingertips were cool and the color took longer than usual to return after she pressed. His pulse was quick and weak. He responded to voice but not to questions, so she noted that he was not fully alert. When the first-aid lead arrived, Priya gave the handover she had rehearsed: who he was, what she had seen, her findings in order, and that he seemed to be getting worse. The lead took over and asked her to stay, record the times and keep checking his breathing until the ambulance came.</w:t>
+        <w:t xml:space="preserve">His airway was open, because he was making sound. She counted his breathing carefully and found it fast. His fingertips were cool and the color took longer than usual to return after she pressed. His pulse was quick and weak. He responded to voice but not to questions, so she noted that he was not fully alert. When the first-aid lead arrived, Priya gave the handover she had rehearsed: who he was, what she had seen, her findings in order, and that he seemed to be getting worse. The lead took over and asked her to stay, record the times and keep checking his breathing until the ambulance came.</w:t>
       </w:r>
     </w:p>
     <w:bookmarkEnd w:id="37"/>
@@ -1962,39 +2016,7 @@
         <w:pStyle w:val="BodyText"/>
       </w:pPr>
       <w:r>
-        <w:t xml:space="preserve">First, make sure you can help without being harmed. Look at the scene, protect yourself, and call for help early if the hazards or the number of patients are beyond you.</w:t>
-      </w:r>
-    </w:p>
-    <w:p>
-      <w:pPr>
-        <w:pStyle w:val="BodyText"/>
-      </w:pPr>
-      <w:r>
-        <w:t xml:space="preserve">Second, find the patient who cannot wait. Sort by danger before you sort by convenience, and keep watching the waiting area, because a label given at the door can be wrong ten minutes later.</w:t>
-      </w:r>
-    </w:p>
-    <w:p>
-      <w:pPr>
-        <w:pStyle w:val="BodyText"/>
-      </w:pPr>
-      <w:r>
-        <w:t xml:space="preserve">Third, assess in a fixed order and treat what you find as you find it. The first look tells you quickly whether the patient is responding normally. Then work through airway, breathing, circulation, disability and exposure, controlling severe bleeding first when it is obvious, and check again after every intervention.</w:t>
-      </w:r>
-    </w:p>
-    <w:p>
-      <w:pPr>
-        <w:pStyle w:val="BodyText"/>
-      </w:pPr>
-      <w:r>
-        <w:t xml:space="preserve">Fourth, gather the history and a full set of vital signs once immediate threats are dealt with, and trust trends over single numbers.</w:t>
-      </w:r>
-    </w:p>
-    <w:p>
-      <w:pPr>
-        <w:pStyle w:val="BodyText"/>
-      </w:pPr>
-      <w:r>
-        <w:t xml:space="preserve">Finally, tell the next team what you found in a fixed order, keep a clear record, and stay within your scope of practice. When something is beyond your role, saying so quickly is a safe and professional act.</w:t>
+        <w:t xml:space="preserve">When two things compete, your own safety comes before the patient’s need, and the patient who cannot wait comes before the patient who complains most. Treating a threat comes before measuring it: a pulse oximeter reading can wait, an obstructed airway cannot. Calling for help comes before finishing the history, the head-to-toe check or the paperwork. A plan is only as good as the next check, so put a time on every observation and decide before you leave the bedside when you will look again. If a task is outside your scope, say so at once and stay with the patient until someone who can do it arrives.</w:t>
       </w:r>
     </w:p>
     <w:bookmarkEnd w:id="38"/>
@@ -2009,312 +2031,432 @@
     </w:p>
     <w:p>
       <w:pPr>
-        <w:pStyle w:val="FirstParagraph"/>
-      </w:pPr>
-      <w:r>
-        <w:rPr>
-          <w:bCs/>
-          <w:b/>
-        </w:rPr>
-        <w:t xml:space="preserve">1.</w:t>
-      </w:r>
-      <w:r>
-        <w:t xml:space="preserve"> </w:t>
-      </w:r>
+        <w:numPr>
+          <w:ilvl w:val="0"/>
+          <w:numId w:val="1004"/>
+        </w:numPr>
+        <w:pStyle w:val="Compact"/>
+      </w:pPr>
       <w:r>
         <w:t xml:space="preserve">What should you do first when you arrive at an emergency scene?</w:t>
       </w:r>
-      <w:r>
-        <w:br/>
-      </w:r>
-      <w:r>
-        <w:t xml:space="preserve">A. Begin the primary survey at once.</w:t>
-      </w:r>
-      <w:r>
-        <w:br/>
-      </w:r>
-      <w:r>
-        <w:t xml:space="preserve">B. Check the scene for hazards and protect yourself.</w:t>
-      </w:r>
-      <w:r>
-        <w:br/>
-      </w:r>
-      <w:r>
-        <w:t xml:space="preserve">C. Take a full set of vital signs.</w:t>
-      </w:r>
-      <w:r>
-        <w:br/>
-      </w:r>
-      <w:r>
-        <w:t xml:space="preserve">D. Record the time on the patient’s chart.</w:t>
-      </w:r>
-    </w:p>
-    <w:p>
-      <w:pPr>
-        <w:pStyle w:val="BodyText"/>
-      </w:pPr>
-      <w:r>
-        <w:rPr>
-          <w:bCs/>
-          <w:b/>
-        </w:rPr>
-        <w:t xml:space="preserve">2.</w:t>
-      </w:r>
-      <w:r>
-        <w:t xml:space="preserve"> </w:t>
-      </w:r>
+    </w:p>
+    <w:p>
+      <w:pPr>
+        <w:numPr>
+          <w:ilvl w:val="1"/>
+          <w:numId w:val="1005"/>
+        </w:numPr>
+        <w:pStyle w:val="Compact"/>
+      </w:pPr>
+      <w:r>
+        <w:t xml:space="preserve">Begin the primary survey at once.</w:t>
+      </w:r>
+    </w:p>
+    <w:p>
+      <w:pPr>
+        <w:numPr>
+          <w:ilvl w:val="1"/>
+          <w:numId w:val="1005"/>
+        </w:numPr>
+        <w:pStyle w:val="Compact"/>
+      </w:pPr>
+      <w:r>
+        <w:t xml:space="preserve">Check the scene for hazards and protect yourself.</w:t>
+      </w:r>
+    </w:p>
+    <w:p>
+      <w:pPr>
+        <w:numPr>
+          <w:ilvl w:val="1"/>
+          <w:numId w:val="1005"/>
+        </w:numPr>
+        <w:pStyle w:val="Compact"/>
+      </w:pPr>
+      <w:r>
+        <w:t xml:space="preserve">Take a full set of vital signs.</w:t>
+      </w:r>
+    </w:p>
+    <w:p>
+      <w:pPr>
+        <w:numPr>
+          <w:ilvl w:val="1"/>
+          <w:numId w:val="1005"/>
+        </w:numPr>
+        <w:pStyle w:val="Compact"/>
+      </w:pPr>
+      <w:r>
+        <w:t xml:space="preserve">Record the time on the patient’s chart.</w:t>
+      </w:r>
+    </w:p>
+    <w:p>
+      <w:pPr>
+        <w:numPr>
+          <w:ilvl w:val="0"/>
+          <w:numId w:val="1004"/>
+        </w:numPr>
+        <w:pStyle w:val="Compact"/>
+      </w:pPr>
       <w:r>
         <w:t xml:space="preserve">Triage sorts patients mainly by which factor?</w:t>
       </w:r>
-      <w:r>
-        <w:br/>
-      </w:r>
-      <w:r>
-        <w:t xml:space="preserve">A. The order in which they arrived.</w:t>
-      </w:r>
-      <w:r>
-        <w:br/>
-      </w:r>
-      <w:r>
-        <w:t xml:space="preserve">B. How loudly they complain.</w:t>
-      </w:r>
-      <w:r>
-        <w:br/>
-      </w:r>
-      <w:r>
-        <w:t xml:space="preserve">C. How soon they must be seen to stay safe.</w:t>
-      </w:r>
-      <w:r>
-        <w:br/>
-      </w:r>
-      <w:r>
-        <w:t xml:space="preserve">D. Their expected length of stay.</w:t>
-      </w:r>
-    </w:p>
-    <w:p>
-      <w:pPr>
-        <w:pStyle w:val="BodyText"/>
-      </w:pPr>
-      <w:r>
-        <w:rPr>
-          <w:bCs/>
-          <w:b/>
-        </w:rPr>
-        <w:t xml:space="preserve">3.</w:t>
-      </w:r>
-      <w:r>
-        <w:t xml:space="preserve"> </w:t>
-      </w:r>
+    </w:p>
+    <w:p>
+      <w:pPr>
+        <w:numPr>
+          <w:ilvl w:val="1"/>
+          <w:numId w:val="1006"/>
+        </w:numPr>
+        <w:pStyle w:val="Compact"/>
+      </w:pPr>
+      <w:r>
+        <w:t xml:space="preserve">The order in which they arrived.</w:t>
+      </w:r>
+    </w:p>
+    <w:p>
+      <w:pPr>
+        <w:numPr>
+          <w:ilvl w:val="1"/>
+          <w:numId w:val="1006"/>
+        </w:numPr>
+        <w:pStyle w:val="Compact"/>
+      </w:pPr>
+      <w:r>
+        <w:t xml:space="preserve">How loudly they complain.</w:t>
+      </w:r>
+    </w:p>
+    <w:p>
+      <w:pPr>
+        <w:numPr>
+          <w:ilvl w:val="1"/>
+          <w:numId w:val="1006"/>
+        </w:numPr>
+        <w:pStyle w:val="Compact"/>
+      </w:pPr>
+      <w:r>
+        <w:t xml:space="preserve">How long they are expected to stay.</w:t>
+      </w:r>
+    </w:p>
+    <w:p>
+      <w:pPr>
+        <w:numPr>
+          <w:ilvl w:val="1"/>
+          <w:numId w:val="1006"/>
+        </w:numPr>
+        <w:pStyle w:val="Compact"/>
+      </w:pPr>
+      <w:r>
+        <w:t xml:space="preserve">How soon they must be seen to stay safe.</w:t>
+      </w:r>
+    </w:p>
+    <w:p>
+      <w:pPr>
+        <w:numPr>
+          <w:ilvl w:val="0"/>
+          <w:numId w:val="1004"/>
+        </w:numPr>
+        <w:pStyle w:val="Compact"/>
+      </w:pPr>
       <w:r>
         <w:t xml:space="preserve">A patient sorted to a low level of acuity becomes short of breath in the waiting room. What is the best response?</w:t>
       </w:r>
-      <w:r>
-        <w:br/>
-      </w:r>
-      <w:r>
-        <w:t xml:space="preserve">A. Leave the level unchanged, since it was assigned by a nurse.</w:t>
-      </w:r>
-      <w:r>
-        <w:br/>
-      </w:r>
-      <w:r>
-        <w:t xml:space="preserve">B. Reassess, raise the level and call for help.</w:t>
-      </w:r>
-      <w:r>
-        <w:br/>
-      </w:r>
-      <w:r>
-        <w:t xml:space="preserve">C. Ask the patient to wait quietly for their turn.</w:t>
-      </w:r>
-      <w:r>
-        <w:br/>
-      </w:r>
-      <w:r>
-        <w:t xml:space="preserve">D. Take only their temperature.</w:t>
-      </w:r>
-    </w:p>
-    <w:p>
-      <w:pPr>
-        <w:pStyle w:val="BodyText"/>
-      </w:pPr>
-      <w:r>
-        <w:rPr>
-          <w:bCs/>
-          <w:b/>
-        </w:rPr>
-        <w:t xml:space="preserve">4.</w:t>
-      </w:r>
-      <w:r>
-        <w:t xml:space="preserve"> </w:t>
-      </w:r>
-      <w:r>
-        <w:t xml:space="preserve">In the primary survey, which letter comes after Circulation?</w:t>
-      </w:r>
-      <w:r>
-        <w:br/>
-      </w:r>
-      <w:r>
-        <w:t xml:space="preserve">A. Airway.</w:t>
-      </w:r>
-      <w:r>
-        <w:br/>
-      </w:r>
-      <w:r>
-        <w:t xml:space="preserve">B. Breathing.</w:t>
-      </w:r>
-      <w:r>
-        <w:br/>
-      </w:r>
-      <w:r>
-        <w:t xml:space="preserve">C. Disability.</w:t>
-      </w:r>
-      <w:r>
-        <w:br/>
-      </w:r>
-      <w:r>
-        <w:t xml:space="preserve">D. Exposure only if the patient is conscious.</w:t>
-      </w:r>
-    </w:p>
-    <w:p>
-      <w:pPr>
-        <w:pStyle w:val="BodyText"/>
-      </w:pPr>
-      <w:r>
-        <w:rPr>
-          <w:bCs/>
-          <w:b/>
-        </w:rPr>
-        <w:t xml:space="preserve">5.</w:t>
-      </w:r>
-      <w:r>
-        <w:t xml:space="preserve"> </w:t>
-      </w:r>
-      <w:r>
-        <w:t xml:space="preserve">A patient responds only when you speak loudly to them. On the AVPU scale, which letter describes this?</w:t>
-      </w:r>
-      <w:r>
-        <w:br/>
-      </w:r>
-      <w:r>
-        <w:t xml:space="preserve">A. A.</w:t>
-      </w:r>
-      <w:r>
-        <w:br/>
-      </w:r>
-      <w:r>
-        <w:t xml:space="preserve">B. V.</w:t>
-      </w:r>
-      <w:r>
-        <w:br/>
-      </w:r>
-      <w:r>
-        <w:t xml:space="preserve">C. P.</w:t>
-      </w:r>
-      <w:r>
-        <w:br/>
-      </w:r>
-      <w:r>
-        <w:t xml:space="preserve">D. U.</w:t>
-      </w:r>
-    </w:p>
-    <w:p>
-      <w:pPr>
-        <w:pStyle w:val="BodyText"/>
-      </w:pPr>
-      <w:r>
-        <w:rPr>
-          <w:bCs/>
-          <w:b/>
-        </w:rPr>
-        <w:t xml:space="preserve">6.</w:t>
-      </w:r>
-      <w:r>
-        <w:t xml:space="preserve"> </w:t>
-      </w:r>
+    </w:p>
+    <w:p>
+      <w:pPr>
+        <w:numPr>
+          <w:ilvl w:val="1"/>
+          <w:numId w:val="1007"/>
+        </w:numPr>
+        <w:pStyle w:val="Compact"/>
+      </w:pPr>
+      <w:r>
+        <w:t xml:space="preserve">Reassess, raise the level and call for help.</w:t>
+      </w:r>
+    </w:p>
+    <w:p>
+      <w:pPr>
+        <w:numPr>
+          <w:ilvl w:val="1"/>
+          <w:numId w:val="1007"/>
+        </w:numPr>
+        <w:pStyle w:val="Compact"/>
+      </w:pPr>
+      <w:r>
+        <w:t xml:space="preserve">Leave the level unchanged, since a nurse assigned it.</w:t>
+      </w:r>
+    </w:p>
+    <w:p>
+      <w:pPr>
+        <w:numPr>
+          <w:ilvl w:val="1"/>
+          <w:numId w:val="1007"/>
+        </w:numPr>
+        <w:pStyle w:val="Compact"/>
+      </w:pPr>
+      <w:r>
+        <w:t xml:space="preserve">Ask the patient to wait quietly for their turn.</w:t>
+      </w:r>
+    </w:p>
+    <w:p>
+      <w:pPr>
+        <w:numPr>
+          <w:ilvl w:val="1"/>
+          <w:numId w:val="1007"/>
+        </w:numPr>
+        <w:pStyle w:val="Compact"/>
+      </w:pPr>
+      <w:r>
+        <w:t xml:space="preserve">Take only their temperature.</w:t>
+      </w:r>
+    </w:p>
+    <w:p>
+      <w:pPr>
+        <w:numPr>
+          <w:ilvl w:val="0"/>
+          <w:numId w:val="1004"/>
+        </w:numPr>
+        <w:pStyle w:val="Compact"/>
+      </w:pPr>
+      <w:r>
+        <w:t xml:space="preserve">A patient has a normal blood pressure, cool pale skin and fast breathing. What is the best interpretation?</w:t>
+      </w:r>
+    </w:p>
+    <w:p>
+      <w:pPr>
+        <w:numPr>
+          <w:ilvl w:val="1"/>
+          <w:numId w:val="1008"/>
+        </w:numPr>
+        <w:pStyle w:val="Compact"/>
+      </w:pPr>
+      <w:r>
+        <w:t xml:space="preserve">The patient is stable because the blood pressure is normal.</w:t>
+      </w:r>
+    </w:p>
+    <w:p>
+      <w:pPr>
+        <w:numPr>
+          <w:ilvl w:val="1"/>
+          <w:numId w:val="1008"/>
+        </w:numPr>
+        <w:pStyle w:val="Compact"/>
+      </w:pPr>
+      <w:r>
+        <w:t xml:space="preserve">The skin color is caused by cold hands and can be ignored.</w:t>
+      </w:r>
+    </w:p>
+    <w:p>
+      <w:pPr>
+        <w:numPr>
+          <w:ilvl w:val="1"/>
+          <w:numId w:val="1008"/>
+        </w:numPr>
+        <w:pStyle w:val="Compact"/>
+      </w:pPr>
+      <w:r>
+        <w:t xml:space="preserve">The patient may still be seriously ill, because blood pressure can stay normal for a time in shock.</w:t>
+      </w:r>
+    </w:p>
+    <w:p>
+      <w:pPr>
+        <w:numPr>
+          <w:ilvl w:val="1"/>
+          <w:numId w:val="1008"/>
+        </w:numPr>
+        <w:pStyle w:val="Compact"/>
+      </w:pPr>
+      <w:r>
+        <w:t xml:space="preserve">The breathing rate does not matter when the blood pressure is normal.</w:t>
+      </w:r>
+    </w:p>
+    <w:p>
+      <w:pPr>
+        <w:numPr>
+          <w:ilvl w:val="0"/>
+          <w:numId w:val="1004"/>
+        </w:numPr>
+        <w:pStyle w:val="Compact"/>
+      </w:pPr>
+      <w:r>
+        <w:t xml:space="preserve">A patient responds only when you speak loudly to them. On the AVPU scale, which level describes this?</w:t>
+      </w:r>
+    </w:p>
+    <w:p>
+      <w:pPr>
+        <w:numPr>
+          <w:ilvl w:val="1"/>
+          <w:numId w:val="1009"/>
+        </w:numPr>
+        <w:pStyle w:val="Compact"/>
+      </w:pPr>
+      <w:r>
+        <w:t xml:space="preserve">Alert.</w:t>
+      </w:r>
+    </w:p>
+    <w:p>
+      <w:pPr>
+        <w:numPr>
+          <w:ilvl w:val="1"/>
+          <w:numId w:val="1009"/>
+        </w:numPr>
+        <w:pStyle w:val="Compact"/>
+      </w:pPr>
+      <w:r>
+        <w:t xml:space="preserve">Pain.</w:t>
+      </w:r>
+    </w:p>
+    <w:p>
+      <w:pPr>
+        <w:numPr>
+          <w:ilvl w:val="1"/>
+          <w:numId w:val="1009"/>
+        </w:numPr>
+        <w:pStyle w:val="Compact"/>
+      </w:pPr>
+      <w:r>
+        <w:t xml:space="preserve">Unresponsive.</w:t>
+      </w:r>
+    </w:p>
+    <w:p>
+      <w:pPr>
+        <w:numPr>
+          <w:ilvl w:val="1"/>
+          <w:numId w:val="1009"/>
+        </w:numPr>
+        <w:pStyle w:val="Compact"/>
+      </w:pPr>
+      <w:r>
+        <w:t xml:space="preserve">Voice.</w:t>
+      </w:r>
+    </w:p>
+    <w:p>
+      <w:pPr>
+        <w:numPr>
+          <w:ilvl w:val="0"/>
+          <w:numId w:val="1004"/>
+        </w:numPr>
+        <w:pStyle w:val="Compact"/>
+      </w:pPr>
       <w:r>
         <w:t xml:space="preserve">Which of these is a limitation of a pulse oximeter?</w:t>
       </w:r>
-      <w:r>
-        <w:br/>
-      </w:r>
-      <w:r>
-        <w:t xml:space="preserve">A. It cannot be used on a finger.</w:t>
-      </w:r>
-      <w:r>
-        <w:br/>
-      </w:r>
-      <w:r>
-        <w:t xml:space="preserve">B. It always reads too high.</w:t>
-      </w:r>
-      <w:r>
-        <w:br/>
-      </w:r>
-      <w:r>
-        <w:t xml:space="preserve">C. It does not show how well a patient is breathing out carbon dioxide.</w:t>
-      </w:r>
-      <w:r>
-        <w:br/>
-      </w:r>
-      <w:r>
-        <w:t xml:space="preserve">D. It replaces the need to count the breathing rate.</w:t>
-      </w:r>
-    </w:p>
-    <w:p>
-      <w:pPr>
-        <w:pStyle w:val="BodyText"/>
-      </w:pPr>
-      <w:r>
-        <w:rPr>
-          <w:bCs/>
-          <w:b/>
-        </w:rPr>
-        <w:t xml:space="preserve">7.</w:t>
-      </w:r>
-      <w:r>
-        <w:t xml:space="preserve"> </w:t>
-      </w:r>
+    </w:p>
+    <w:p>
+      <w:pPr>
+        <w:numPr>
+          <w:ilvl w:val="1"/>
+          <w:numId w:val="1010"/>
+        </w:numPr>
+        <w:pStyle w:val="Compact"/>
+      </w:pPr>
+      <w:r>
+        <w:t xml:space="preserve">It does not show how well a patient is breathing out carbon dioxide.</w:t>
+      </w:r>
+    </w:p>
+    <w:p>
+      <w:pPr>
+        <w:numPr>
+          <w:ilvl w:val="1"/>
+          <w:numId w:val="1010"/>
+        </w:numPr>
+        <w:pStyle w:val="Compact"/>
+      </w:pPr>
+      <w:r>
+        <w:t xml:space="preserve">It cannot be used on a finger.</w:t>
+      </w:r>
+    </w:p>
+    <w:p>
+      <w:pPr>
+        <w:numPr>
+          <w:ilvl w:val="1"/>
+          <w:numId w:val="1010"/>
+        </w:numPr>
+        <w:pStyle w:val="Compact"/>
+      </w:pPr>
+      <w:r>
+        <w:t xml:space="preserve">It can only be used when the patient is awake.</w:t>
+      </w:r>
+    </w:p>
+    <w:p>
+      <w:pPr>
+        <w:numPr>
+          <w:ilvl w:val="1"/>
+          <w:numId w:val="1010"/>
+        </w:numPr>
+        <w:pStyle w:val="Compact"/>
+      </w:pPr>
+      <w:r>
+        <w:t xml:space="preserve">It replaces the need to count the breathing rate.</w:t>
+      </w:r>
+    </w:p>
+    <w:p>
+      <w:pPr>
+        <w:numPr>
+          <w:ilvl w:val="0"/>
+          <w:numId w:val="1004"/>
+        </w:numPr>
+        <w:pStyle w:val="Compact"/>
+      </w:pPr>
       <w:r>
         <w:t xml:space="preserve">In a handover that uses Situation, Background, Assessment and Recommendation, where do the primary survey findings belong?</w:t>
       </w:r>
-      <w:r>
-        <w:br/>
-      </w:r>
-      <w:r>
-        <w:t xml:space="preserve">A. Situation.</w:t>
-      </w:r>
-      <w:r>
-        <w:br/>
-      </w:r>
-      <w:r>
-        <w:t xml:space="preserve">B. Background.</w:t>
-      </w:r>
-      <w:r>
-        <w:br/>
-      </w:r>
-      <w:r>
-        <w:t xml:space="preserve">C. Assessment.</w:t>
-      </w:r>
-      <w:r>
-        <w:br/>
-      </w:r>
-      <w:r>
-        <w:t xml:space="preserve">D. Recommendation.</w:t>
-      </w:r>
-    </w:p>
-    <w:p>
-      <w:pPr>
-        <w:pStyle w:val="BodyText"/>
-      </w:pPr>
-      <w:r>
-        <w:rPr>
-          <w:bCs/>
-          <w:b/>
-        </w:rPr>
-        <w:t xml:space="preserve">8.</w:t>
-      </w:r>
-      <w:r>
-        <w:t xml:space="preserve"> </w:t>
-      </w:r>
+    </w:p>
+    <w:p>
+      <w:pPr>
+        <w:numPr>
+          <w:ilvl w:val="1"/>
+          <w:numId w:val="1011"/>
+        </w:numPr>
+        <w:pStyle w:val="Compact"/>
+      </w:pPr>
+      <w:r>
+        <w:t xml:space="preserve">Situation.</w:t>
+      </w:r>
+    </w:p>
+    <w:p>
+      <w:pPr>
+        <w:numPr>
+          <w:ilvl w:val="1"/>
+          <w:numId w:val="1011"/>
+        </w:numPr>
+        <w:pStyle w:val="Compact"/>
+      </w:pPr>
+      <w:r>
+        <w:t xml:space="preserve">Background.</w:t>
+      </w:r>
+    </w:p>
+    <w:p>
+      <w:pPr>
+        <w:numPr>
+          <w:ilvl w:val="1"/>
+          <w:numId w:val="1011"/>
+        </w:numPr>
+        <w:pStyle w:val="Compact"/>
+      </w:pPr>
+      <w:r>
+        <w:t xml:space="preserve">Assessment.</w:t>
+      </w:r>
+    </w:p>
+    <w:p>
+      <w:pPr>
+        <w:numPr>
+          <w:ilvl w:val="1"/>
+          <w:numId w:val="1011"/>
+        </w:numPr>
+        <w:pStyle w:val="Compact"/>
+      </w:pPr>
+      <w:r>
+        <w:t xml:space="preserve">Recommendation.</w:t>
+      </w:r>
+    </w:p>
+    <w:p>
+      <w:pPr>
+        <w:numPr>
+          <w:ilvl w:val="0"/>
+          <w:numId w:val="1004"/>
+        </w:numPr>
+        <w:pStyle w:val="Compact"/>
+      </w:pPr>
       <w:r>
         <w:t xml:space="preserve">Short case. You find an older adult slumped on a bench in a park, breathing fast and responding only to voice. List, in order, the first four things you would do.</w:t>
       </w:r>
@@ -2512,6 +2654,91 @@
       </w:pPr>
     </w:lvl>
   </w:abstractNum>
+  <w:abstractNum w:abstractNumId="99821">
+    <w:nsid w:val="A99821"/>
+    <w:multiLevelType w:val="multilevel"/>
+    <w:lvl w:ilvl="0">
+      <w:start w:val="1"/>
+      <w:numFmt w:val="upperLetter"/>
+      <w:lvlText w:val="%1)"/>
+      <w:lvlJc w:val="left"/>
+      <w:pPr>
+        <w:ind w:left="720" w:hanging="480"/>
+      </w:pPr>
+    </w:lvl>
+    <w:lvl w:ilvl="1">
+      <w:start w:val="1"/>
+      <w:numFmt w:val="upperLetter"/>
+      <w:lvlText w:val="%2)"/>
+      <w:lvlJc w:val="left"/>
+      <w:pPr>
+        <w:ind w:left="1440" w:hanging="480"/>
+      </w:pPr>
+    </w:lvl>
+    <w:lvl w:ilvl="2">
+      <w:start w:val="1"/>
+      <w:numFmt w:val="upperLetter"/>
+      <w:lvlText w:val="%3)"/>
+      <w:lvlJc w:val="left"/>
+      <w:pPr>
+        <w:ind w:left="2160" w:hanging="480"/>
+      </w:pPr>
+    </w:lvl>
+    <w:lvl w:ilvl="3">
+      <w:start w:val="1"/>
+      <w:numFmt w:val="upperLetter"/>
+      <w:lvlText w:val="%4)"/>
+      <w:lvlJc w:val="left"/>
+      <w:pPr>
+        <w:ind w:left="2880" w:hanging="480"/>
+      </w:pPr>
+    </w:lvl>
+    <w:lvl w:ilvl="4">
+      <w:start w:val="1"/>
+      <w:numFmt w:val="upperLetter"/>
+      <w:lvlText w:val="%5)"/>
+      <w:lvlJc w:val="left"/>
+      <w:pPr>
+        <w:ind w:left="3600" w:hanging="480"/>
+      </w:pPr>
+    </w:lvl>
+    <w:lvl w:ilvl="5">
+      <w:start w:val="1"/>
+      <w:numFmt w:val="upperLetter"/>
+      <w:lvlText w:val="%6)"/>
+      <w:lvlJc w:val="left"/>
+      <w:pPr>
+        <w:ind w:left="4320" w:hanging="480"/>
+      </w:pPr>
+    </w:lvl>
+    <w:lvl w:ilvl="6">
+      <w:start w:val="1"/>
+      <w:numFmt w:val="upperLetter"/>
+      <w:lvlText w:val="%7)"/>
+      <w:lvlJc w:val="left"/>
+      <w:pPr>
+        <w:ind w:left="5040" w:hanging="480"/>
+      </w:pPr>
+    </w:lvl>
+    <w:lvl w:ilvl="7">
+      <w:start w:val="1"/>
+      <w:numFmt w:val="upperLetter"/>
+      <w:lvlText w:val="%8)"/>
+      <w:lvlJc w:val="left"/>
+      <w:pPr>
+        <w:ind w:left="5760" w:hanging="480"/>
+      </w:pPr>
+    </w:lvl>
+    <w:lvl w:ilvl="8">
+      <w:start w:val="1"/>
+      <w:numFmt w:val="upperLetter"/>
+      <w:lvlText w:val="%9)"/>
+      <w:lvlJc w:val="left"/>
+      <w:pPr>
+        <w:ind w:left="6480" w:hanging="480"/>
+      </w:pPr>
+    </w:lvl>
+  </w:abstractNum>
   <w:num w:numId="1000">
     <w:abstractNumId w:val="990"/>
   </w:num>
@@ -2577,6 +2804,246 @@
   </w:num>
   <w:num w:numId="1003">
     <w:abstractNumId w:val="99411"/>
+    <w:lvlOverride w:ilvl="0">
+      <w:startOverride w:val="1"/>
+    </w:lvlOverride>
+    <w:lvlOverride w:ilvl="1">
+      <w:startOverride w:val="1"/>
+    </w:lvlOverride>
+    <w:lvlOverride w:ilvl="2">
+      <w:startOverride w:val="1"/>
+    </w:lvlOverride>
+    <w:lvlOverride w:ilvl="3">
+      <w:startOverride w:val="1"/>
+    </w:lvlOverride>
+    <w:lvlOverride w:ilvl="4">
+      <w:startOverride w:val="1"/>
+    </w:lvlOverride>
+    <w:lvlOverride w:ilvl="5">
+      <w:startOverride w:val="1"/>
+    </w:lvlOverride>
+    <w:lvlOverride w:ilvl="6">
+      <w:startOverride w:val="1"/>
+    </w:lvlOverride>
+    <w:lvlOverride w:ilvl="7">
+      <w:startOverride w:val="1"/>
+    </w:lvlOverride>
+    <w:lvlOverride w:ilvl="8">
+      <w:startOverride w:val="1"/>
+    </w:lvlOverride>
+  </w:num>
+  <w:num w:numId="1004">
+    <w:abstractNumId w:val="99411"/>
+    <w:lvlOverride w:ilvl="0">
+      <w:startOverride w:val="1"/>
+    </w:lvlOverride>
+    <w:lvlOverride w:ilvl="1">
+      <w:startOverride w:val="1"/>
+    </w:lvlOverride>
+    <w:lvlOverride w:ilvl="2">
+      <w:startOverride w:val="1"/>
+    </w:lvlOverride>
+    <w:lvlOverride w:ilvl="3">
+      <w:startOverride w:val="1"/>
+    </w:lvlOverride>
+    <w:lvlOverride w:ilvl="4">
+      <w:startOverride w:val="1"/>
+    </w:lvlOverride>
+    <w:lvlOverride w:ilvl="5">
+      <w:startOverride w:val="1"/>
+    </w:lvlOverride>
+    <w:lvlOverride w:ilvl="6">
+      <w:startOverride w:val="1"/>
+    </w:lvlOverride>
+    <w:lvlOverride w:ilvl="7">
+      <w:startOverride w:val="1"/>
+    </w:lvlOverride>
+    <w:lvlOverride w:ilvl="8">
+      <w:startOverride w:val="1"/>
+    </w:lvlOverride>
+  </w:num>
+  <w:num w:numId="1005">
+    <w:abstractNumId w:val="99821"/>
+    <w:lvlOverride w:ilvl="0">
+      <w:startOverride w:val="1"/>
+    </w:lvlOverride>
+    <w:lvlOverride w:ilvl="1">
+      <w:startOverride w:val="1"/>
+    </w:lvlOverride>
+    <w:lvlOverride w:ilvl="2">
+      <w:startOverride w:val="1"/>
+    </w:lvlOverride>
+    <w:lvlOverride w:ilvl="3">
+      <w:startOverride w:val="1"/>
+    </w:lvlOverride>
+    <w:lvlOverride w:ilvl="4">
+      <w:startOverride w:val="1"/>
+    </w:lvlOverride>
+    <w:lvlOverride w:ilvl="5">
+      <w:startOverride w:val="1"/>
+    </w:lvlOverride>
+    <w:lvlOverride w:ilvl="6">
+      <w:startOverride w:val="1"/>
+    </w:lvlOverride>
+    <w:lvlOverride w:ilvl="7">
+      <w:startOverride w:val="1"/>
+    </w:lvlOverride>
+    <w:lvlOverride w:ilvl="8">
+      <w:startOverride w:val="1"/>
+    </w:lvlOverride>
+  </w:num>
+  <w:num w:numId="1006">
+    <w:abstractNumId w:val="99821"/>
+    <w:lvlOverride w:ilvl="0">
+      <w:startOverride w:val="1"/>
+    </w:lvlOverride>
+    <w:lvlOverride w:ilvl="1">
+      <w:startOverride w:val="1"/>
+    </w:lvlOverride>
+    <w:lvlOverride w:ilvl="2">
+      <w:startOverride w:val="1"/>
+    </w:lvlOverride>
+    <w:lvlOverride w:ilvl="3">
+      <w:startOverride w:val="1"/>
+    </w:lvlOverride>
+    <w:lvlOverride w:ilvl="4">
+      <w:startOverride w:val="1"/>
+    </w:lvlOverride>
+    <w:lvlOverride w:ilvl="5">
+      <w:startOverride w:val="1"/>
+    </w:lvlOverride>
+    <w:lvlOverride w:ilvl="6">
+      <w:startOverride w:val="1"/>
+    </w:lvlOverride>
+    <w:lvlOverride w:ilvl="7">
+      <w:startOverride w:val="1"/>
+    </w:lvlOverride>
+    <w:lvlOverride w:ilvl="8">
+      <w:startOverride w:val="1"/>
+    </w:lvlOverride>
+  </w:num>
+  <w:num w:numId="1007">
+    <w:abstractNumId w:val="99821"/>
+    <w:lvlOverride w:ilvl="0">
+      <w:startOverride w:val="1"/>
+    </w:lvlOverride>
+    <w:lvlOverride w:ilvl="1">
+      <w:startOverride w:val="1"/>
+    </w:lvlOverride>
+    <w:lvlOverride w:ilvl="2">
+      <w:startOverride w:val="1"/>
+    </w:lvlOverride>
+    <w:lvlOverride w:ilvl="3">
+      <w:startOverride w:val="1"/>
+    </w:lvlOverride>
+    <w:lvlOverride w:ilvl="4">
+      <w:startOverride w:val="1"/>
+    </w:lvlOverride>
+    <w:lvlOverride w:ilvl="5">
+      <w:startOverride w:val="1"/>
+    </w:lvlOverride>
+    <w:lvlOverride w:ilvl="6">
+      <w:startOverride w:val="1"/>
+    </w:lvlOverride>
+    <w:lvlOverride w:ilvl="7">
+      <w:startOverride w:val="1"/>
+    </w:lvlOverride>
+    <w:lvlOverride w:ilvl="8">
+      <w:startOverride w:val="1"/>
+    </w:lvlOverride>
+  </w:num>
+  <w:num w:numId="1008">
+    <w:abstractNumId w:val="99821"/>
+    <w:lvlOverride w:ilvl="0">
+      <w:startOverride w:val="1"/>
+    </w:lvlOverride>
+    <w:lvlOverride w:ilvl="1">
+      <w:startOverride w:val="1"/>
+    </w:lvlOverride>
+    <w:lvlOverride w:ilvl="2">
+      <w:startOverride w:val="1"/>
+    </w:lvlOverride>
+    <w:lvlOverride w:ilvl="3">
+      <w:startOverride w:val="1"/>
+    </w:lvlOverride>
+    <w:lvlOverride w:ilvl="4">
+      <w:startOverride w:val="1"/>
+    </w:lvlOverride>
+    <w:lvlOverride w:ilvl="5">
+      <w:startOverride w:val="1"/>
+    </w:lvlOverride>
+    <w:lvlOverride w:ilvl="6">
+      <w:startOverride w:val="1"/>
+    </w:lvlOverride>
+    <w:lvlOverride w:ilvl="7">
+      <w:startOverride w:val="1"/>
+    </w:lvlOverride>
+    <w:lvlOverride w:ilvl="8">
+      <w:startOverride w:val="1"/>
+    </w:lvlOverride>
+  </w:num>
+  <w:num w:numId="1009">
+    <w:abstractNumId w:val="99821"/>
+    <w:lvlOverride w:ilvl="0">
+      <w:startOverride w:val="1"/>
+    </w:lvlOverride>
+    <w:lvlOverride w:ilvl="1">
+      <w:startOverride w:val="1"/>
+    </w:lvlOverride>
+    <w:lvlOverride w:ilvl="2">
+      <w:startOverride w:val="1"/>
+    </w:lvlOverride>
+    <w:lvlOverride w:ilvl="3">
+      <w:startOverride w:val="1"/>
+    </w:lvlOverride>
+    <w:lvlOverride w:ilvl="4">
+      <w:startOverride w:val="1"/>
+    </w:lvlOverride>
+    <w:lvlOverride w:ilvl="5">
+      <w:startOverride w:val="1"/>
+    </w:lvlOverride>
+    <w:lvlOverride w:ilvl="6">
+      <w:startOverride w:val="1"/>
+    </w:lvlOverride>
+    <w:lvlOverride w:ilvl="7">
+      <w:startOverride w:val="1"/>
+    </w:lvlOverride>
+    <w:lvlOverride w:ilvl="8">
+      <w:startOverride w:val="1"/>
+    </w:lvlOverride>
+  </w:num>
+  <w:num w:numId="1010">
+    <w:abstractNumId w:val="99821"/>
+    <w:lvlOverride w:ilvl="0">
+      <w:startOverride w:val="1"/>
+    </w:lvlOverride>
+    <w:lvlOverride w:ilvl="1">
+      <w:startOverride w:val="1"/>
+    </w:lvlOverride>
+    <w:lvlOverride w:ilvl="2">
+      <w:startOverride w:val="1"/>
+    </w:lvlOverride>
+    <w:lvlOverride w:ilvl="3">
+      <w:startOverride w:val="1"/>
+    </w:lvlOverride>
+    <w:lvlOverride w:ilvl="4">
+      <w:startOverride w:val="1"/>
+    </w:lvlOverride>
+    <w:lvlOverride w:ilvl="5">
+      <w:startOverride w:val="1"/>
+    </w:lvlOverride>
+    <w:lvlOverride w:ilvl="6">
+      <w:startOverride w:val="1"/>
+    </w:lvlOverride>
+    <w:lvlOverride w:ilvl="7">
+      <w:startOverride w:val="1"/>
+    </w:lvlOverride>
+    <w:lvlOverride w:ilvl="8">
+      <w:startOverride w:val="1"/>
+    </w:lvlOverride>
+  </w:num>
+  <w:num w:numId="1011">
+    <w:abstractNumId w:val="99821"/>
     <w:lvlOverride w:ilvl="0">
       <w:startOverride w:val="1"/>
     </w:lvlOverride>

</xml_diff>

<commit_message>
Part 1: fact-check round 2 corrections
</commit_message>
<xml_diff>
--- a/books/emergency-medicine/previews/ch01.docx
+++ b/books/emergency-medicine/previews/ch01.docx
@@ -431,7 +431,7 @@
         <w:pStyle w:val="BodyText"/>
       </w:pPr>
       <w:r>
-        <w:t xml:space="preserve">The first question asks whether the patient will die or be harmed within minutes without help, for example from an obstructed airway or a stopped heart. If yes, that patient is at the top level and you act at once. The second question asks whether the patient could worsen quickly, seems newly confused or drowsy, or is in severe pain. Such patients are very unwell and should not wait, even though no action needs to happen in the next few seconds. If neither applies, the remaining patients are sorted by how many separate tests or treatments they will probably need, such as laboratory tests, imaging or procedures. The last step is to check the vital signs against the level you chose and consider moving the patient up if they are in a danger range (Entry 1.4 gives typical resting values).</w:t>
+        <w:t xml:space="preserve">Three questions, asked in order, do the sorting. The first finds the patient who needs action at once, for example from an obstructed airway or a stopped heart. The second finds the patient who should not wait even though nothing must happen in the next few seconds. Everyone else is sorted by how many different kinds of resources they will probably need, such as laboratory tests, imaging, intravenous treatment or a procedure. Simple care such as an examination, a dressing, a splint or a medicine taken by mouth does not count. The last step is to check the vital signs against the level you chose and consider moving the patient up if they are in a danger range (Entry 1.4 gives typical resting values).</w:t>
       </w:r>
     </w:p>
     <w:p>
@@ -599,7 +599,7 @@
               <w:jc w:val="left"/>
             </w:pPr>
             <w:r>
-              <w:t xml:space="preserve">May die or be harmed within minutes without help</w:t>
+              <w:t xml:space="preserve">Needs immediate life-saving action to stay alive</w:t>
             </w:r>
           </w:p>
         </w:tc>
@@ -675,7 +675,7 @@
               <w:jc w:val="left"/>
             </w:pPr>
             <w:r>
-              <w:t xml:space="preserve">Stable, but expected to need two or more separate tests or treatments</w:t>
+              <w:t xml:space="preserve">Stable, but expected to need two or more kinds of resources (for example, a blood test and imaging)</w:t>
             </w:r>
           </w:p>
         </w:tc>
@@ -713,7 +713,7 @@
               <w:jc w:val="left"/>
             </w:pPr>
             <w:r>
-              <w:t xml:space="preserve">Stable, expected to need one test or treatment</w:t>
+              <w:t xml:space="preserve">Stable, expected to need one kind of resource</w:t>
             </w:r>
           </w:p>
         </w:tc>
@@ -751,7 +751,7 @@
               <w:jc w:val="left"/>
             </w:pPr>
             <w:r>
-              <w:t xml:space="preserve">Stable, expected to need no tests or treatments</w:t>
+              <w:t xml:space="preserve">Stable, expected to need no resources beyond an examination and simple care</w:t>
             </w:r>
           </w:p>
         </w:tc>
@@ -1176,7 +1176,7 @@
         <w:pStyle w:val="BodyText"/>
       </w:pPr>
       <w:r>
-        <w:t xml:space="preserve">Treat the neck (cervical spine) with care if there is any chance of neck injury, and do not move an injured patient unless the scene is unsafe or you must move them to give life-saving care such as CPR, as your protocol directs.</w:t>
+        <w:t xml:space="preserve">Treat the neck (cervical spine) with care if there is any chance of neck injury, and do not move an injured patient unless the scene is unsafe or your protocol directs a move to give life-saving care, and then keep the head, neck and body in line as far as you can.</w:t>
       </w:r>
     </w:p>
     <w:p>
@@ -1574,15 +1574,15 @@
         <w:pStyle w:val="BodyText"/>
       </w:pPr>
       <w:r>
-        <w:t xml:space="preserve">A reading outside its range is an abnormal finding. Report it, and treat a large departure, or any departure in a patient who looks unwell, as urgent.</w:t>
-      </w:r>
-    </w:p>
-    <w:p>
-      <w:pPr>
-        <w:pStyle w:val="BodyText"/>
-      </w:pPr>
-      <w:r>
-        <w:t xml:space="preserve">Treat the trend as more informative than any one reading. A breathing rate that climbs from 18 to 28 over 20 minutes tells you more than a single count, and a breathing rate above about 25 breaths per minute is a marker of illness that calls for urgent attention and a call to your supervisor. Blood pressure can stay normal for a time even in shock, because the body tightens its blood vessels to compensate, so a normal reading does not by itself make a patient safe.</w:t>
+        <w:t xml:space="preserve">A reading outside its range may be abnormal for that patient. Report it, and treat a large departure, or any departure in a patient who looks unwell, as urgent.</w:t>
+      </w:r>
+    </w:p>
+    <w:p>
+      <w:pPr>
+        <w:pStyle w:val="BodyText"/>
+      </w:pPr>
+      <w:r>
+        <w:t xml:space="preserve">Treat the trend as more informative than any one reading. A breathing rate that climbs from 18 to 28 over 20 minutes tells you more than a single count, and a breathing rate above about 25 breaths per minute is a marker of illness and a warning that the patient may deteriorate suddenly, so report it to your supervisor or the responsible clinician at once. Blood pressure can stay normal for a time even in shock, because the body tightens its blood vessels to compensate, so a normal reading does not by itself make a patient safe.</w:t>
       </w:r>
     </w:p>
     <w:p>
@@ -1778,7 +1778,7 @@
         <w:t xml:space="preserve"> </w:t>
       </w:r>
       <w:r>
-        <w:t xml:space="preserve">Introduce yourself, say what you are about to do and why, and ask permission before you touch. A patient who has capacity, meaning the ability to understand the choice and its results, may accept or refuse care, and you respect that choice, tell a clinician and record it. In a true emergency, when a patient cannot take part in decisions and no one who can decide for them is available, treatment may start without prior consent, and the patient is told as soon as possible. The rules differ between states, services and roles, so follow your local protocol and the guidance of your supervisor.</w:t>
+        <w:t xml:space="preserve">Introduce yourself, say what you are about to do and why, and ask permission before you touch. A patient who has capacity, meaning the ability to understand the information, see how it applies to their own situation, weigh the options and state a choice, may accept or refuse care, and you respect that choice, tell a clinician and record it. In a true emergency, when a patient cannot take part in decisions and no one who can decide for them is available, treatment may start without prior consent, and the patient is told as soon as possible. The rules differ between states, services and roles, so follow your local protocol and the guidance of your supervisor.</w:t>
       </w:r>
     </w:p>
     <w:p>
@@ -1792,7 +1792,7 @@
         <w:t xml:space="preserve"> </w:t>
       </w:r>
       <w:r>
-        <w:t xml:space="preserve">Your scope of practice is the set of tasks your license, certification or student status allows. Do only what it allows, say plainly when a task is beyond it, and ask your supervisor before trying anything you have not been taught and cleared to do.</w:t>
+        <w:t xml:space="preserve">Your scope of practice is the set of tasks you are legally authorized and trained to perform. It depends on your license or certification, your education, your role and the setting, and students work under the rules of their program and their supervisor. Do only what it allows, say plainly when a task is beyond it, and ask your supervisor before trying anything you have not been taught and cleared to do.</w:t>
       </w:r>
     </w:p>
     <w:p>

</xml_diff>